<commit_message>
Notfallkonzept-Fix: Do not list hidden users in the frontend
https://github.com/jonasmueller1/sac-pilatus-website/issues/171
</commit_message>
<xml_diff>
--- a/contao/templates/docx/event_rapport_tour.docx
+++ b/contao/templates/docx/event_rapport_tour.docx
@@ -924,7 +924,21 @@
                 <w:sz w:val="20"/>
                 <w:szCs w:val="20"/>
               </w:rPr>
-              <w:t>} W und ${countM</w:t>
+              <w:t>} W</w:t>
+            </w:r>
+            <w:r>
+              <w:rPr>
+                <w:sz w:val="20"/>
+                <w:szCs w:val="20"/>
+              </w:rPr>
+              <w:t xml:space="preserve">, </w:t>
+            </w:r>
+            <w:r>
+              <w:rPr>
+                <w:sz w:val="20"/>
+                <w:szCs w:val="20"/>
+              </w:rPr>
+              <w:t>${countM</w:t>
             </w:r>
             <w:r>
               <w:rPr>
@@ -939,6 +953,13 @@
                 <w:szCs w:val="20"/>
               </w:rPr>
               <w:t>} M</w:t>
+            </w:r>
+            <w:r>
+              <w:rPr>
+                <w:sz w:val="20"/>
+                <w:szCs w:val="20"/>
+              </w:rPr>
+              <w:t>, ${countDivers} D</w:t>
             </w:r>
           </w:p>
         </w:tc>

</xml_diff>